<commit_message>
Accept Syncfusion 34.2.8 Word and Excel snapshots
</commit_message>
<xml_diff>
--- a/src/Tests/ProtectionTests.VerifyWordProtected.verified.docx
+++ b/src/Tests/ProtectionTests.VerifyWordProtected.verified.docx
@@ -24,7 +24,7 @@
       </w:r>
       <w:r>
         <w:rPr/>
-        <w:instrText xml:space="preserve">HYPERLINK "https://www.syncfusion.com/account/claim-license-key?pl=d29yZCx3b3JkZWRpdG9yLGdyaWRzZGs=&amp;vs=MzQuMS4yOQ==" </w:instrText>
+        <w:instrText xml:space="preserve">HYPERLINK "https://www.syncfusion.com/account/claim-license-key?pl=d29yZCx3b3JkZWRpdG9yLGdyaWRzZGs=&amp;vs=MzQuMi44" </w:instrText>
       </w:r>
       <w:r>
         <w:rPr/>
@@ -2146,7 +2146,7 @@
       </w:r>
       <w:r>
         <w:rPr/>
-        <w:instrText xml:space="preserve">HYPERLINK "https://www.syncfusion.com/account/claim-license-key?pl=d29yZCx3b3JkZWRpdG9yLGdyaWRzZGs=&amp;vs=MzQuMS4yOQ==" </w:instrText>
+        <w:instrText xml:space="preserve">HYPERLINK "https://www.syncfusion.com/account/claim-license-key?pl=d29yZCx3b3JkZWRpdG9yLGdyaWRzZGs=&amp;vs=MzQuMi44" </w:instrText>
       </w:r>
       <w:r>
         <w:rPr/>

</xml_diff>